<commit_message>
Add FENG app and generalize availability on resume and cover letter.
Ship FENG in client apps, refresh resume/cover assets, and replace remote/collaboration wording with open-to-new-opportunities language.

Co-authored-by: Cursor <cursoragent@cursor.com>
</commit_message>
<xml_diff>
--- a/Muhammad-Saim-Resume.docx
+++ b/Muhammad-Saim-Resume.docx
@@ -163,7 +163,7 @@
           <w:color w:val="4A5060"/>
           <w:sz w:val="20"/>
         </w:rPr>
-        <w:t xml:space="preserve">Senior Mobile App Developer with 3+ years shipping production Android and iOS apps in Flutter. </w:t>
+        <w:t>Senior Mobile App Developer with 3+ years shipping production Android and iOS apps in Flutter. 25+ published apps across client and self-owned products — architecture through App Store / Play Store release. Currently at Scarmatrix, Lahore. Open to new opportunities.</w:t>
       </w:r>
       <w:r>
         <w:rPr>
@@ -172,7 +172,6 @@
           <w:color w:val="4A5060"/>
           <w:sz w:val="20"/>
         </w:rPr>
-        <w:t>25+ published apps</w:t>
       </w:r>
       <w:r>
         <w:rPr>
@@ -181,7 +180,6 @@
           <w:color w:val="4A5060"/>
           <w:sz w:val="20"/>
         </w:rPr>
-        <w:t xml:space="preserve"> across client and self-owned products — architecture through App Store / Play Store release. Currently at Scarmatrix, Lahore. Open to remote roles, freelance work, and long-term collaborations.</w:t>
       </w:r>
     </w:p>
     <w:p>
@@ -442,6 +440,7 @@
         <w:t>SELECTED PROJECTS</w:t>
       </w:r>
     </w:p>
+    <w:p/>
     <w:p>
       <w:pPr>
         <w:spacing w:after="40" w:before="0" w:line="276" w:lineRule="auto"/>
@@ -463,6 +462,17 @@
           <w:sz w:val="20"/>
         </w:rPr>
         <w:t xml:space="preserve"> — Safe meetings &amp; live location (iOS)</w:t>
+      </w:r>
+    </w:p>
+    <w:p>
+      <w:pPr/>
+      <w:r>
+        <w:rPr>
+          <w:rFonts w:ascii="Calibri" w:hAnsi="Calibri"/>
+          <w:b/>
+          <w:sz w:val="20"/>
+        </w:rPr>
+        <w:t>• FENG — Dating app (Android)</w:t>
       </w:r>
     </w:p>
     <w:p>

</xml_diff>